<commit_message>
docs: estado real del tablero Jira (123 listo, 21 en curso, 22 por hacer)
Co-Authored-By: Claude Opus 5.5 <noreply@anthropic.com>
</commit_message>
<xml_diff>
--- a/docs/entrega-2do-corte/01_Plan_de_gestion_del_proyecto/Enlace_Jira_StockPot.docx
+++ b/docs/entrega-2do-corte/01_Plan_de_gestion_del_proyecto/Enlace_Jira_StockPot.docx
@@ -64,7 +64,7 @@
               <w:rPr>
                 <w:sz w:val="20"/>
               </w:rPr>
-              <w:t>StockPot (clave SP)</w:t>
+              <w:t>StockPot (clave STOC) — sitio mateopuentes1227.atlassian.net</w:t>
             </w:r>
           </w:p>
         </w:tc>
@@ -82,7 +82,7 @@
                 <w:b/>
                 <w:sz w:val="20"/>
               </w:rPr>
-              <w:t>Enlace</w:t>
+              <w:t>Enlace del tablero</w:t>
             </w:r>
           </w:p>
         </w:tc>
@@ -96,7 +96,7 @@
               <w:rPr>
                 <w:sz w:val="20"/>
               </w:rPr>
-              <w:t>[pegar aquí el enlace del tablero de Jira]</w:t>
+              <w:t>https://mateopuentes1227.atlassian.net/jira/software/projects/STOC/boards/34</w:t>
             </w:r>
           </w:p>
         </w:tc>
@@ -146,7 +146,7 @@
                 <w:b/>
                 <w:sz w:val="20"/>
               </w:rPr>
-              <w:t>Metodología</w:t>
+              <w:t>Contenido</w:t>
             </w:r>
           </w:p>
         </w:tc>
@@ -160,7 +160,7 @@
               <w:rPr>
                 <w:sz w:val="20"/>
               </w:rPr>
-              <w:t>Scrum con 4 sprints (uno por iteración); GitFlow en GitHub con una rama por requisito</w:t>
+              <w:t>166 tareas del plan PERT (análisis, diseño, codificación y pruebas), repartidas entre los 4 integrantes, con fecha de vencimiento entre el 10/08/2026 y el 13/11/2026</w:t>
             </w:r>
           </w:p>
         </w:tc>
@@ -178,7 +178,7 @@
                 <w:b/>
                 <w:sz w:val="20"/>
               </w:rPr>
-              <w:t>Fecha</w:t>
+              <w:t>Estado al 19/10/2026</w:t>
             </w:r>
           </w:p>
         </w:tc>
@@ -192,7 +192,7 @@
               <w:rPr>
                 <w:sz w:val="20"/>
               </w:rPr>
-              <w:t>19/10/2026</w:t>
+              <w:t>Listo: 123 · En curso: 21 · Por hacer: 22</w:t>
             </w:r>
           </w:p>
         </w:tc>
@@ -203,7 +203,557 @@
         <w:pStyle w:val="Heading1"/>
       </w:pPr>
       <w:r>
-        <w:t>Estructura registrada en Jira</w:t>
+        <w:t>Tareas por integrante y estado</w:t>
+      </w:r>
+    </w:p>
+    <w:tbl>
+      <w:tblPr>
+        <w:tblStyle w:val="TableGrid"/>
+        <w:tblW w:type="auto" w:w="0"/>
+        <w:tblLook w:firstColumn="1" w:firstRow="1" w:lastColumn="0" w:lastRow="0" w:noHBand="0" w:noVBand="1" w:val="04A0"/>
+      </w:tblPr>
+      <w:tblGrid>
+        <w:gridCol w:w="1627"/>
+        <w:gridCol w:w="1627"/>
+        <w:gridCol w:w="1627"/>
+        <w:gridCol w:w="1627"/>
+        <w:gridCol w:w="1627"/>
+        <w:gridCol w:w="1627"/>
+      </w:tblGrid>
+      <w:tr>
+        <w:tc>
+          <w:tcPr>
+            <w:tcW w:type="dxa" w:w="2835"/>
+            <w:shd w:val="clear" w:color="auto" w:fill="F5DED5"/>
+          </w:tcPr>
+          <w:p>
+            <w:r/>
+            <w:r>
+              <w:rPr>
+                <w:b/>
+                <w:sz w:val="18"/>
+              </w:rPr>
+              <w:t>Integrante</w:t>
+            </w:r>
+          </w:p>
+        </w:tc>
+        <w:tc>
+          <w:tcPr>
+            <w:tcW w:type="dxa" w:w="1701"/>
+            <w:shd w:val="clear" w:color="auto" w:fill="F5DED5"/>
+          </w:tcPr>
+          <w:p>
+            <w:r/>
+            <w:r>
+              <w:rPr>
+                <w:b/>
+                <w:sz w:val="18"/>
+              </w:rPr>
+              <w:t>Iteración</w:t>
+            </w:r>
+          </w:p>
+        </w:tc>
+        <w:tc>
+          <w:tcPr>
+            <w:tcW w:type="dxa" w:w="1134"/>
+            <w:shd w:val="clear" w:color="auto" w:fill="F5DED5"/>
+          </w:tcPr>
+          <w:p>
+            <w:r/>
+            <w:r>
+              <w:rPr>
+                <w:b/>
+                <w:sz w:val="18"/>
+              </w:rPr>
+              <w:t>Tareas</w:t>
+            </w:r>
+          </w:p>
+        </w:tc>
+        <w:tc>
+          <w:tcPr>
+            <w:tcW w:type="dxa" w:w="1134"/>
+            <w:shd w:val="clear" w:color="auto" w:fill="F5DED5"/>
+          </w:tcPr>
+          <w:p>
+            <w:r/>
+            <w:r>
+              <w:rPr>
+                <w:b/>
+                <w:sz w:val="18"/>
+              </w:rPr>
+              <w:t>Listo</w:t>
+            </w:r>
+          </w:p>
+        </w:tc>
+        <w:tc>
+          <w:tcPr>
+            <w:tcW w:type="dxa" w:w="1134"/>
+            <w:shd w:val="clear" w:color="auto" w:fill="F5DED5"/>
+          </w:tcPr>
+          <w:p>
+            <w:r/>
+            <w:r>
+              <w:rPr>
+                <w:b/>
+                <w:sz w:val="18"/>
+              </w:rPr>
+              <w:t>En curso</w:t>
+            </w:r>
+          </w:p>
+        </w:tc>
+        <w:tc>
+          <w:tcPr>
+            <w:tcW w:type="dxa" w:w="1134"/>
+            <w:shd w:val="clear" w:color="auto" w:fill="F5DED5"/>
+          </w:tcPr>
+          <w:p>
+            <w:r/>
+            <w:r>
+              <w:rPr>
+                <w:b/>
+                <w:sz w:val="18"/>
+              </w:rPr>
+              <w:t>Por hacer</w:t>
+            </w:r>
+          </w:p>
+        </w:tc>
+      </w:tr>
+      <w:tr>
+        <w:tc>
+          <w:tcPr>
+            <w:tcW w:type="dxa" w:w="2835"/>
+          </w:tcPr>
+          <w:p>
+            <w:r/>
+            <w:r>
+              <w:rPr>
+                <w:sz w:val="18"/>
+              </w:rPr>
+              <w:t>Andrés Mateo (Night_Killer)</w:t>
+            </w:r>
+          </w:p>
+        </w:tc>
+        <w:tc>
+          <w:tcPr>
+            <w:tcW w:type="dxa" w:w="1701"/>
+          </w:tcPr>
+          <w:p>
+            <w:r/>
+            <w:r>
+              <w:rPr>
+                <w:sz w:val="18"/>
+              </w:rPr>
+              <w:t>Iteración 1</w:t>
+            </w:r>
+          </w:p>
+        </w:tc>
+        <w:tc>
+          <w:tcPr>
+            <w:tcW w:type="dxa" w:w="1134"/>
+          </w:tcPr>
+          <w:p>
+            <w:r/>
+            <w:r>
+              <w:rPr>
+                <w:sz w:val="18"/>
+              </w:rPr>
+              <w:t>39</w:t>
+            </w:r>
+          </w:p>
+        </w:tc>
+        <w:tc>
+          <w:tcPr>
+            <w:tcW w:type="dxa" w:w="1134"/>
+          </w:tcPr>
+          <w:p>
+            <w:r/>
+            <w:r>
+              <w:rPr>
+                <w:sz w:val="18"/>
+              </w:rPr>
+              <w:t>38</w:t>
+            </w:r>
+          </w:p>
+        </w:tc>
+        <w:tc>
+          <w:tcPr>
+            <w:tcW w:type="dxa" w:w="1134"/>
+          </w:tcPr>
+          <w:p>
+            <w:r/>
+            <w:r>
+              <w:rPr>
+                <w:sz w:val="18"/>
+              </w:rPr>
+              <w:t>0</w:t>
+            </w:r>
+          </w:p>
+        </w:tc>
+        <w:tc>
+          <w:tcPr>
+            <w:tcW w:type="dxa" w:w="1134"/>
+          </w:tcPr>
+          <w:p>
+            <w:r/>
+            <w:r>
+              <w:rPr>
+                <w:sz w:val="18"/>
+              </w:rPr>
+              <w:t>1</w:t>
+            </w:r>
+          </w:p>
+        </w:tc>
+      </w:tr>
+      <w:tr>
+        <w:tc>
+          <w:tcPr>
+            <w:tcW w:type="dxa" w:w="2835"/>
+          </w:tcPr>
+          <w:p>
+            <w:r/>
+            <w:r>
+              <w:rPr>
+                <w:sz w:val="18"/>
+              </w:rPr>
+              <w:t>Jhorman Caballero</w:t>
+            </w:r>
+          </w:p>
+        </w:tc>
+        <w:tc>
+          <w:tcPr>
+            <w:tcW w:type="dxa" w:w="1701"/>
+          </w:tcPr>
+          <w:p>
+            <w:r/>
+            <w:r>
+              <w:rPr>
+                <w:sz w:val="18"/>
+              </w:rPr>
+              <w:t>Iteración 2</w:t>
+            </w:r>
+          </w:p>
+        </w:tc>
+        <w:tc>
+          <w:tcPr>
+            <w:tcW w:type="dxa" w:w="1134"/>
+          </w:tcPr>
+          <w:p>
+            <w:r/>
+            <w:r>
+              <w:rPr>
+                <w:sz w:val="18"/>
+              </w:rPr>
+              <w:t>42</w:t>
+            </w:r>
+          </w:p>
+        </w:tc>
+        <w:tc>
+          <w:tcPr>
+            <w:tcW w:type="dxa" w:w="1134"/>
+          </w:tcPr>
+          <w:p>
+            <w:r/>
+            <w:r>
+              <w:rPr>
+                <w:sz w:val="18"/>
+              </w:rPr>
+              <w:t>42</w:t>
+            </w:r>
+          </w:p>
+        </w:tc>
+        <w:tc>
+          <w:tcPr>
+            <w:tcW w:type="dxa" w:w="1134"/>
+          </w:tcPr>
+          <w:p>
+            <w:r/>
+            <w:r>
+              <w:rPr>
+                <w:sz w:val="18"/>
+              </w:rPr>
+              <w:t>0</w:t>
+            </w:r>
+          </w:p>
+        </w:tc>
+        <w:tc>
+          <w:tcPr>
+            <w:tcW w:type="dxa" w:w="1134"/>
+          </w:tcPr>
+          <w:p>
+            <w:r/>
+            <w:r>
+              <w:rPr>
+                <w:sz w:val="18"/>
+              </w:rPr>
+              <w:t>0</w:t>
+            </w:r>
+          </w:p>
+        </w:tc>
+      </w:tr>
+      <w:tr>
+        <w:tc>
+          <w:tcPr>
+            <w:tcW w:type="dxa" w:w="2835"/>
+          </w:tcPr>
+          <w:p>
+            <w:r/>
+            <w:r>
+              <w:rPr>
+                <w:sz w:val="18"/>
+              </w:rPr>
+              <w:t>Yovany Peñaranda</w:t>
+            </w:r>
+          </w:p>
+        </w:tc>
+        <w:tc>
+          <w:tcPr>
+            <w:tcW w:type="dxa" w:w="1701"/>
+          </w:tcPr>
+          <w:p>
+            <w:r/>
+            <w:r>
+              <w:rPr>
+                <w:sz w:val="18"/>
+              </w:rPr>
+              <w:t>Iteración 3</w:t>
+            </w:r>
+          </w:p>
+        </w:tc>
+        <w:tc>
+          <w:tcPr>
+            <w:tcW w:type="dxa" w:w="1134"/>
+          </w:tcPr>
+          <w:p>
+            <w:r/>
+            <w:r>
+              <w:rPr>
+                <w:sz w:val="18"/>
+              </w:rPr>
+              <w:t>44</w:t>
+            </w:r>
+          </w:p>
+        </w:tc>
+        <w:tc>
+          <w:tcPr>
+            <w:tcW w:type="dxa" w:w="1134"/>
+          </w:tcPr>
+          <w:p>
+            <w:r/>
+            <w:r>
+              <w:rPr>
+                <w:sz w:val="18"/>
+              </w:rPr>
+              <w:t>2</w:t>
+            </w:r>
+          </w:p>
+        </w:tc>
+        <w:tc>
+          <w:tcPr>
+            <w:tcW w:type="dxa" w:w="1134"/>
+          </w:tcPr>
+          <w:p>
+            <w:r/>
+            <w:r>
+              <w:rPr>
+                <w:sz w:val="18"/>
+              </w:rPr>
+              <w:t>21</w:t>
+            </w:r>
+          </w:p>
+        </w:tc>
+        <w:tc>
+          <w:tcPr>
+            <w:tcW w:type="dxa" w:w="1134"/>
+          </w:tcPr>
+          <w:p>
+            <w:r/>
+            <w:r>
+              <w:rPr>
+                <w:sz w:val="18"/>
+              </w:rPr>
+              <w:t>21</w:t>
+            </w:r>
+          </w:p>
+        </w:tc>
+      </w:tr>
+      <w:tr>
+        <w:tc>
+          <w:tcPr>
+            <w:tcW w:type="dxa" w:w="2835"/>
+          </w:tcPr>
+          <w:p>
+            <w:r/>
+            <w:r>
+              <w:rPr>
+                <w:sz w:val="18"/>
+              </w:rPr>
+              <w:t>Ángel Rodríguez</w:t>
+            </w:r>
+          </w:p>
+        </w:tc>
+        <w:tc>
+          <w:tcPr>
+            <w:tcW w:type="dxa" w:w="1701"/>
+          </w:tcPr>
+          <w:p>
+            <w:r/>
+            <w:r>
+              <w:rPr>
+                <w:sz w:val="18"/>
+              </w:rPr>
+              <w:t>Iteración 4</w:t>
+            </w:r>
+          </w:p>
+        </w:tc>
+        <w:tc>
+          <w:tcPr>
+            <w:tcW w:type="dxa" w:w="1134"/>
+          </w:tcPr>
+          <w:p>
+            <w:r/>
+            <w:r>
+              <w:rPr>
+                <w:sz w:val="18"/>
+              </w:rPr>
+              <w:t>41</w:t>
+            </w:r>
+          </w:p>
+        </w:tc>
+        <w:tc>
+          <w:tcPr>
+            <w:tcW w:type="dxa" w:w="1134"/>
+          </w:tcPr>
+          <w:p>
+            <w:r/>
+            <w:r>
+              <w:rPr>
+                <w:sz w:val="18"/>
+              </w:rPr>
+              <w:t>41</w:t>
+            </w:r>
+          </w:p>
+        </w:tc>
+        <w:tc>
+          <w:tcPr>
+            <w:tcW w:type="dxa" w:w="1134"/>
+          </w:tcPr>
+          <w:p>
+            <w:r/>
+            <w:r>
+              <w:rPr>
+                <w:sz w:val="18"/>
+              </w:rPr>
+              <w:t>0</w:t>
+            </w:r>
+          </w:p>
+        </w:tc>
+        <w:tc>
+          <w:tcPr>
+            <w:tcW w:type="dxa" w:w="1134"/>
+          </w:tcPr>
+          <w:p>
+            <w:r/>
+            <w:r>
+              <w:rPr>
+                <w:sz w:val="18"/>
+              </w:rPr>
+              <w:t>0</w:t>
+            </w:r>
+          </w:p>
+        </w:tc>
+      </w:tr>
+      <w:tr>
+        <w:tc>
+          <w:tcPr>
+            <w:tcW w:type="dxa" w:w="2835"/>
+          </w:tcPr>
+          <w:p>
+            <w:r/>
+            <w:r>
+              <w:rPr>
+                <w:sz w:val="18"/>
+              </w:rPr>
+              <w:t>TOTAL</w:t>
+            </w:r>
+          </w:p>
+        </w:tc>
+        <w:tc>
+          <w:tcPr>
+            <w:tcW w:type="dxa" w:w="1701"/>
+          </w:tcPr>
+          <w:p>
+            <w:r/>
+            <w:r>
+              <w:rPr>
+                <w:sz w:val="18"/>
+              </w:rPr>
+            </w:r>
+          </w:p>
+        </w:tc>
+        <w:tc>
+          <w:tcPr>
+            <w:tcW w:type="dxa" w:w="1134"/>
+          </w:tcPr>
+          <w:p>
+            <w:r/>
+            <w:r>
+              <w:rPr>
+                <w:sz w:val="18"/>
+              </w:rPr>
+              <w:t>166</w:t>
+            </w:r>
+          </w:p>
+        </w:tc>
+        <w:tc>
+          <w:tcPr>
+            <w:tcW w:type="dxa" w:w="1134"/>
+          </w:tcPr>
+          <w:p>
+            <w:r/>
+            <w:r>
+              <w:rPr>
+                <w:sz w:val="18"/>
+              </w:rPr>
+              <w:t>123</w:t>
+            </w:r>
+          </w:p>
+        </w:tc>
+        <w:tc>
+          <w:tcPr>
+            <w:tcW w:type="dxa" w:w="1134"/>
+          </w:tcPr>
+          <w:p>
+            <w:r/>
+            <w:r>
+              <w:rPr>
+                <w:sz w:val="18"/>
+              </w:rPr>
+              <w:t>21</w:t>
+            </w:r>
+          </w:p>
+        </w:tc>
+        <w:tc>
+          <w:tcPr>
+            <w:tcW w:type="dxa" w:w="1134"/>
+          </w:tcPr>
+          <w:p>
+            <w:r/>
+            <w:r>
+              <w:rPr>
+                <w:sz w:val="18"/>
+              </w:rPr>
+              <w:t>22</w:t>
+            </w:r>
+          </w:p>
+        </w:tc>
+      </w:tr>
+    </w:tbl>
+    <w:p>
+      <w:pPr>
+        <w:pStyle w:val="Heading1"/>
+      </w:pPr>
+      <w:r>
+        <w:t>Tareas por fase</w:t>
       </w:r>
     </w:p>
     <w:tbl>
@@ -222,7 +772,7 @@
       <w:tr>
         <w:tc>
           <w:tcPr>
-            <w:tcW w:type="dxa" w:w="1701"/>
+            <w:tcW w:type="dxa" w:w="2835"/>
             <w:shd w:val="clear" w:color="auto" w:fill="F5DED5"/>
           </w:tcPr>
           <w:p>
@@ -232,7 +782,7 @@
                 <w:b/>
                 <w:sz w:val="18"/>
               </w:rPr>
-              <w:t>Integrante</w:t>
+              <w:t>Fase</w:t>
             </w:r>
           </w:p>
         </w:tc>
@@ -248,13 +798,13 @@
                 <w:b/>
                 <w:sz w:val="18"/>
               </w:rPr>
-              <w:t>Sprint</w:t>
+              <w:t>Tareas</w:t>
             </w:r>
           </w:p>
         </w:tc>
         <w:tc>
           <w:tcPr>
-            <w:tcW w:type="dxa" w:w="1134"/>
+            <w:tcW w:type="dxa" w:w="1417"/>
             <w:shd w:val="clear" w:color="auto" w:fill="F5DED5"/>
           </w:tcPr>
           <w:p>
@@ -264,13 +814,13 @@
                 <w:b/>
                 <w:sz w:val="18"/>
               </w:rPr>
-              <w:t>Épica</w:t>
+              <w:t>Listo</w:t>
             </w:r>
           </w:p>
         </w:tc>
         <w:tc>
           <w:tcPr>
-            <w:tcW w:type="dxa" w:w="3685"/>
+            <w:tcW w:type="dxa" w:w="1417"/>
             <w:shd w:val="clear" w:color="auto" w:fill="F5DED5"/>
           </w:tcPr>
           <w:p>
@@ -280,13 +830,13 @@
                 <w:b/>
                 <w:sz w:val="18"/>
               </w:rPr>
-              <w:t>Módulo</w:t>
+              <w:t>En curso</w:t>
             </w:r>
           </w:p>
         </w:tc>
         <w:tc>
           <w:tcPr>
-            <w:tcW w:type="dxa" w:w="850"/>
+            <w:tcW w:type="dxa" w:w="1417"/>
             <w:shd w:val="clear" w:color="auto" w:fill="F5DED5"/>
           </w:tcPr>
           <w:p>
@@ -296,7 +846,7 @@
                 <w:b/>
                 <w:sz w:val="18"/>
               </w:rPr>
-              <w:t>PF</w:t>
+              <w:t>Por hacer</w:t>
             </w:r>
           </w:p>
         </w:tc>
@@ -304,7 +854,7 @@
       <w:tr>
         <w:tc>
           <w:tcPr>
-            <w:tcW w:type="dxa" w:w="1701"/>
+            <w:tcW w:type="dxa" w:w="2835"/>
           </w:tcPr>
           <w:p>
             <w:r/>
@@ -312,7 +862,7 @@
               <w:rPr>
                 <w:sz w:val="18"/>
               </w:rPr>
-              <w:t>Mateo</w:t>
+              <w:t>Análisis</w:t>
             </w:r>
           </w:p>
         </w:tc>
@@ -326,65 +876,7 @@
               <w:rPr>
                 <w:sz w:val="18"/>
               </w:rPr>
-              <w:t>Sprint 1</w:t>
-            </w:r>
-          </w:p>
-        </w:tc>
-        <w:tc>
-          <w:tcPr>
-            <w:tcW w:type="dxa" w:w="1134"/>
-          </w:tcPr>
-          <w:p>
-            <w:r/>
-            <w:r>
-              <w:rPr>
-                <w:sz w:val="18"/>
-              </w:rPr>
-              <w:t>EP-01</w:t>
-            </w:r>
-          </w:p>
-        </w:tc>
-        <w:tc>
-          <w:tcPr>
-            <w:tcW w:type="dxa" w:w="3685"/>
-          </w:tcPr>
-          <w:p>
-            <w:r/>
-            <w:r>
-              <w:rPr>
-                <w:sz w:val="18"/>
-              </w:rPr>
-              <w:t>Gestión de usuarios y roles</w:t>
-            </w:r>
-          </w:p>
-        </w:tc>
-        <w:tc>
-          <w:tcPr>
-            <w:tcW w:type="dxa" w:w="850"/>
-          </w:tcPr>
-          <w:p>
-            <w:r/>
-            <w:r>
-              <w:rPr>
-                <w:sz w:val="18"/>
-              </w:rPr>
-              <w:t>21</w:t>
-            </w:r>
-          </w:p>
-        </w:tc>
-      </w:tr>
-      <w:tr>
-        <w:tc>
-          <w:tcPr>
-            <w:tcW w:type="dxa" w:w="1701"/>
-          </w:tcPr>
-          <w:p>
-            <w:r/>
-            <w:r>
-              <w:rPr>
-                <w:sz w:val="18"/>
-              </w:rPr>
-              <w:t>Mateo</w:t>
+              <w:t>44</w:t>
             </w:r>
           </w:p>
         </w:tc>
@@ -398,65 +890,7 @@
               <w:rPr>
                 <w:sz w:val="18"/>
               </w:rPr>
-              <w:t>Sprint 1</w:t>
-            </w:r>
-          </w:p>
-        </w:tc>
-        <w:tc>
-          <w:tcPr>
-            <w:tcW w:type="dxa" w:w="1134"/>
-          </w:tcPr>
-          <w:p>
-            <w:r/>
-            <w:r>
-              <w:rPr>
-                <w:sz w:val="18"/>
-              </w:rPr>
-              <w:t>EP-02</w:t>
-            </w:r>
-          </w:p>
-        </w:tc>
-        <w:tc>
-          <w:tcPr>
-            <w:tcW w:type="dxa" w:w="3685"/>
-          </w:tcPr>
-          <w:p>
-            <w:r/>
-            <w:r>
-              <w:rPr>
-                <w:sz w:val="18"/>
-              </w:rPr>
-              <w:t>Gestión de proveedores</w:t>
-            </w:r>
-          </w:p>
-        </w:tc>
-        <w:tc>
-          <w:tcPr>
-            <w:tcW w:type="dxa" w:w="850"/>
-          </w:tcPr>
-          <w:p>
-            <w:r/>
-            <w:r>
-              <w:rPr>
-                <w:sz w:val="18"/>
-              </w:rPr>
               <w:t>34</w:t>
-            </w:r>
-          </w:p>
-        </w:tc>
-      </w:tr>
-      <w:tr>
-        <w:tc>
-          <w:tcPr>
-            <w:tcW w:type="dxa" w:w="1701"/>
-          </w:tcPr>
-          <w:p>
-            <w:r/>
-            <w:r>
-              <w:rPr>
-                <w:sz w:val="18"/>
-              </w:rPr>
-              <w:t>Jorman</w:t>
             </w:r>
           </w:p>
         </w:tc>
@@ -470,65 +904,7 @@
               <w:rPr>
                 <w:sz w:val="18"/>
               </w:rPr>
-              <w:t>Sprint 2</w:t>
-            </w:r>
-          </w:p>
-        </w:tc>
-        <w:tc>
-          <w:tcPr>
-            <w:tcW w:type="dxa" w:w="1134"/>
-          </w:tcPr>
-          <w:p>
-            <w:r/>
-            <w:r>
-              <w:rPr>
-                <w:sz w:val="18"/>
-              </w:rPr>
-              <w:t>EP-03</w:t>
-            </w:r>
-          </w:p>
-        </w:tc>
-        <w:tc>
-          <w:tcPr>
-            <w:tcW w:type="dxa" w:w="3685"/>
-          </w:tcPr>
-          <w:p>
-            <w:r/>
-            <w:r>
-              <w:rPr>
-                <w:sz w:val="18"/>
-              </w:rPr>
-              <w:t>Gestión de inventario</w:t>
-            </w:r>
-          </w:p>
-        </w:tc>
-        <w:tc>
-          <w:tcPr>
-            <w:tcW w:type="dxa" w:w="850"/>
-          </w:tcPr>
-          <w:p>
-            <w:r/>
-            <w:r>
-              <w:rPr>
-                <w:sz w:val="18"/>
-              </w:rPr>
-              <w:t>36</w:t>
-            </w:r>
-          </w:p>
-        </w:tc>
-      </w:tr>
-      <w:tr>
-        <w:tc>
-          <w:tcPr>
-            <w:tcW w:type="dxa" w:w="1701"/>
-          </w:tcPr>
-          <w:p>
-            <w:r/>
-            <w:r>
-              <w:rPr>
-                <w:sz w:val="18"/>
-              </w:rPr>
-              <w:t>Jorman</w:t>
+              <w:t>10</w:t>
             </w:r>
           </w:p>
         </w:tc>
@@ -542,13 +918,15 @@
               <w:rPr>
                 <w:sz w:val="18"/>
               </w:rPr>
-              <w:t>Sprint 2</w:t>
+              <w:t>0</w:t>
             </w:r>
           </w:p>
         </w:tc>
+      </w:tr>
+      <w:tr>
         <w:tc>
           <w:tcPr>
-            <w:tcW w:type="dxa" w:w="1134"/>
+            <w:tcW w:type="dxa" w:w="2835"/>
           </w:tcPr>
           <w:p>
             <w:r/>
@@ -556,51 +934,7 @@
               <w:rPr>
                 <w:sz w:val="18"/>
               </w:rPr>
-              <w:t>EP-04</w:t>
-            </w:r>
-          </w:p>
-        </w:tc>
-        <w:tc>
-          <w:tcPr>
-            <w:tcW w:type="dxa" w:w="3685"/>
-          </w:tcPr>
-          <w:p>
-            <w:r/>
-            <w:r>
-              <w:rPr>
-                <w:sz w:val="18"/>
-              </w:rPr>
-              <w:t>Gestión de productos y menú</w:t>
-            </w:r>
-          </w:p>
-        </w:tc>
-        <w:tc>
-          <w:tcPr>
-            <w:tcW w:type="dxa" w:w="850"/>
-          </w:tcPr>
-          <w:p>
-            <w:r/>
-            <w:r>
-              <w:rPr>
-                <w:sz w:val="18"/>
-              </w:rPr>
-              <w:t>23</w:t>
-            </w:r>
-          </w:p>
-        </w:tc>
-      </w:tr>
-      <w:tr>
-        <w:tc>
-          <w:tcPr>
-            <w:tcW w:type="dxa" w:w="1701"/>
-          </w:tcPr>
-          <w:p>
-            <w:r/>
-            <w:r>
-              <w:rPr>
-                <w:sz w:val="18"/>
-              </w:rPr>
-              <w:t>Yovany</w:t>
+              <w:t>Diseño</w:t>
             </w:r>
           </w:p>
         </w:tc>
@@ -614,65 +948,7 @@
               <w:rPr>
                 <w:sz w:val="18"/>
               </w:rPr>
-              <w:t>Sprint 3</w:t>
-            </w:r>
-          </w:p>
-        </w:tc>
-        <w:tc>
-          <w:tcPr>
-            <w:tcW w:type="dxa" w:w="1134"/>
-          </w:tcPr>
-          <w:p>
-            <w:r/>
-            <w:r>
-              <w:rPr>
-                <w:sz w:val="18"/>
-              </w:rPr>
-              <w:t>EP-05</w:t>
-            </w:r>
-          </w:p>
-        </w:tc>
-        <w:tc>
-          <w:tcPr>
-            <w:tcW w:type="dxa" w:w="3685"/>
-          </w:tcPr>
-          <w:p>
-            <w:r/>
-            <w:r>
-              <w:rPr>
-                <w:sz w:val="18"/>
-              </w:rPr>
-              <w:t>Gestión de pedidos</w:t>
-            </w:r>
-          </w:p>
-        </w:tc>
-        <w:tc>
-          <w:tcPr>
-            <w:tcW w:type="dxa" w:w="850"/>
-          </w:tcPr>
-          <w:p>
-            <w:r/>
-            <w:r>
-              <w:rPr>
-                <w:sz w:val="18"/>
-              </w:rPr>
-              <w:t>42</w:t>
-            </w:r>
-          </w:p>
-        </w:tc>
-      </w:tr>
-      <w:tr>
-        <w:tc>
-          <w:tcPr>
-            <w:tcW w:type="dxa" w:w="1701"/>
-          </w:tcPr>
-          <w:p>
-            <w:r/>
-            <w:r>
-              <w:rPr>
-                <w:sz w:val="18"/>
-              </w:rPr>
-              <w:t>Yovany</w:t>
+              <w:t>46</w:t>
             </w:r>
           </w:p>
         </w:tc>
@@ -686,65 +962,7 @@
               <w:rPr>
                 <w:sz w:val="18"/>
               </w:rPr>
-              <w:t>Sprint 3</w:t>
-            </w:r>
-          </w:p>
-        </w:tc>
-        <w:tc>
-          <w:tcPr>
-            <w:tcW w:type="dxa" w:w="1134"/>
-          </w:tcPr>
-          <w:p>
-            <w:r/>
-            <w:r>
-              <w:rPr>
-                <w:sz w:val="18"/>
-              </w:rPr>
-              <w:t>EP-06</w:t>
-            </w:r>
-          </w:p>
-        </w:tc>
-        <w:tc>
-          <w:tcPr>
-            <w:tcW w:type="dxa" w:w="3685"/>
-          </w:tcPr>
-          <w:p>
-            <w:r/>
-            <w:r>
-              <w:rPr>
-                <w:sz w:val="18"/>
-              </w:rPr>
-              <w:t>Gestión de cocina</w:t>
-            </w:r>
-          </w:p>
-        </w:tc>
-        <w:tc>
-          <w:tcPr>
-            <w:tcW w:type="dxa" w:w="850"/>
-          </w:tcPr>
-          <w:p>
-            <w:r/>
-            <w:r>
-              <w:rPr>
-                <w:sz w:val="18"/>
-              </w:rPr>
-              <w:t>26</w:t>
-            </w:r>
-          </w:p>
-        </w:tc>
-      </w:tr>
-      <w:tr>
-        <w:tc>
-          <w:tcPr>
-            <w:tcW w:type="dxa" w:w="1701"/>
-          </w:tcPr>
-          <w:p>
-            <w:r/>
-            <w:r>
-              <w:rPr>
-                <w:sz w:val="18"/>
-              </w:rPr>
-              <w:t>Yovany</w:t>
+              <w:t>34</w:t>
             </w:r>
           </w:p>
         </w:tc>
@@ -758,65 +976,7 @@
               <w:rPr>
                 <w:sz w:val="18"/>
               </w:rPr>
-              <w:t>Sprint 3</w:t>
-            </w:r>
-          </w:p>
-        </w:tc>
-        <w:tc>
-          <w:tcPr>
-            <w:tcW w:type="dxa" w:w="1134"/>
-          </w:tcPr>
-          <w:p>
-            <w:r/>
-            <w:r>
-              <w:rPr>
-                <w:sz w:val="18"/>
-              </w:rPr>
-              <w:t>EP-07</w:t>
-            </w:r>
-          </w:p>
-        </w:tc>
-        <w:tc>
-          <w:tcPr>
-            <w:tcW w:type="dxa" w:w="3685"/>
-          </w:tcPr>
-          <w:p>
-            <w:r/>
-            <w:r>
-              <w:rPr>
-                <w:sz w:val="18"/>
-              </w:rPr>
-              <w:t>Gestión de reservas</w:t>
-            </w:r>
-          </w:p>
-        </w:tc>
-        <w:tc>
-          <w:tcPr>
-            <w:tcW w:type="dxa" w:w="850"/>
-          </w:tcPr>
-          <w:p>
-            <w:r/>
-            <w:r>
-              <w:rPr>
-                <w:sz w:val="18"/>
-              </w:rPr>
-              <w:t>29</w:t>
-            </w:r>
-          </w:p>
-        </w:tc>
-      </w:tr>
-      <w:tr>
-        <w:tc>
-          <w:tcPr>
-            <w:tcW w:type="dxa" w:w="1701"/>
-          </w:tcPr>
-          <w:p>
-            <w:r/>
-            <w:r>
-              <w:rPr>
-                <w:sz w:val="18"/>
-              </w:rPr>
-              <w:t>Ángel</w:t>
+              <w:t>11</w:t>
             </w:r>
           </w:p>
         </w:tc>
@@ -830,13 +990,15 @@
               <w:rPr>
                 <w:sz w:val="18"/>
               </w:rPr>
-              <w:t>Sprint 4</w:t>
+              <w:t>1</w:t>
             </w:r>
           </w:p>
         </w:tc>
+      </w:tr>
+      <w:tr>
         <w:tc>
           <w:tcPr>
-            <w:tcW w:type="dxa" w:w="1134"/>
+            <w:tcW w:type="dxa" w:w="2835"/>
           </w:tcPr>
           <w:p>
             <w:r/>
@@ -844,51 +1006,7 @@
               <w:rPr>
                 <w:sz w:val="18"/>
               </w:rPr>
-              <w:t>EP-08</w:t>
-            </w:r>
-          </w:p>
-        </w:tc>
-        <w:tc>
-          <w:tcPr>
-            <w:tcW w:type="dxa" w:w="3685"/>
-          </w:tcPr>
-          <w:p>
-            <w:r/>
-            <w:r>
-              <w:rPr>
-                <w:sz w:val="18"/>
-              </w:rPr>
-              <w:t>Gestión de domicilios</w:t>
-            </w:r>
-          </w:p>
-        </w:tc>
-        <w:tc>
-          <w:tcPr>
-            <w:tcW w:type="dxa" w:w="850"/>
-          </w:tcPr>
-          <w:p>
-            <w:r/>
-            <w:r>
-              <w:rPr>
-                <w:sz w:val="18"/>
-              </w:rPr>
-              <w:t>33</w:t>
-            </w:r>
-          </w:p>
-        </w:tc>
-      </w:tr>
-      <w:tr>
-        <w:tc>
-          <w:tcPr>
-            <w:tcW w:type="dxa" w:w="1701"/>
-          </w:tcPr>
-          <w:p>
-            <w:r/>
-            <w:r>
-              <w:rPr>
-                <w:sz w:val="18"/>
-              </w:rPr>
-              <w:t>Ángel</w:t>
+              <w:t>Codificación</w:t>
             </w:r>
           </w:p>
         </w:tc>
@@ -902,65 +1020,7 @@
               <w:rPr>
                 <w:sz w:val="18"/>
               </w:rPr>
-              <w:t>Sprint 4</w:t>
-            </w:r>
-          </w:p>
-        </w:tc>
-        <w:tc>
-          <w:tcPr>
-            <w:tcW w:type="dxa" w:w="1134"/>
-          </w:tcPr>
-          <w:p>
-            <w:r/>
-            <w:r>
-              <w:rPr>
-                <w:sz w:val="18"/>
-              </w:rPr>
-              <w:t>EP-09</w:t>
-            </w:r>
-          </w:p>
-        </w:tc>
-        <w:tc>
-          <w:tcPr>
-            <w:tcW w:type="dxa" w:w="3685"/>
-          </w:tcPr>
-          <w:p>
-            <w:r/>
-            <w:r>
-              <w:rPr>
-                <w:sz w:val="18"/>
-              </w:rPr>
-              <w:t>Gestión de pagos</w:t>
-            </w:r>
-          </w:p>
-        </w:tc>
-        <w:tc>
-          <w:tcPr>
-            <w:tcW w:type="dxa" w:w="850"/>
-          </w:tcPr>
-          <w:p>
-            <w:r/>
-            <w:r>
-              <w:rPr>
-                <w:sz w:val="18"/>
-              </w:rPr>
-              <w:t>29</w:t>
-            </w:r>
-          </w:p>
-        </w:tc>
-      </w:tr>
-      <w:tr>
-        <w:tc>
-          <w:tcPr>
-            <w:tcW w:type="dxa" w:w="1701"/>
-          </w:tcPr>
-          <w:p>
-            <w:r/>
-            <w:r>
-              <w:rPr>
-                <w:sz w:val="18"/>
-              </w:rPr>
-              <w:t>Ángel</w:t>
+              <w:t>54</w:t>
             </w:r>
           </w:p>
         </w:tc>
@@ -974,65 +1034,7 @@
               <w:rPr>
                 <w:sz w:val="18"/>
               </w:rPr>
-              <w:t>Sprint 4</w:t>
-            </w:r>
-          </w:p>
-        </w:tc>
-        <w:tc>
-          <w:tcPr>
-            <w:tcW w:type="dxa" w:w="1134"/>
-          </w:tcPr>
-          <w:p>
-            <w:r/>
-            <w:r>
-              <w:rPr>
-                <w:sz w:val="18"/>
-              </w:rPr>
-              <w:t>EP-10</w:t>
-            </w:r>
-          </w:p>
-        </w:tc>
-        <w:tc>
-          <w:tcPr>
-            <w:tcW w:type="dxa" w:w="3685"/>
-          </w:tcPr>
-          <w:p>
-            <w:r/>
-            <w:r>
-              <w:rPr>
-                <w:sz w:val="18"/>
-              </w:rPr>
-              <w:t>Gestión de ventas y consumo</w:t>
-            </w:r>
-          </w:p>
-        </w:tc>
-        <w:tc>
-          <w:tcPr>
-            <w:tcW w:type="dxa" w:w="850"/>
-          </w:tcPr>
-          <w:p>
-            <w:r/>
-            <w:r>
-              <w:rPr>
-                <w:sz w:val="18"/>
-              </w:rPr>
-              <w:t>26</w:t>
-            </w:r>
-          </w:p>
-        </w:tc>
-      </w:tr>
-      <w:tr>
-        <w:tc>
-          <w:tcPr>
-            <w:tcW w:type="dxa" w:w="1701"/>
-          </w:tcPr>
-          <w:p>
-            <w:r/>
-            <w:r>
-              <w:rPr>
-                <w:sz w:val="18"/>
-              </w:rPr>
-              <w:t>Ángel</w:t>
+              <w:t>39</w:t>
             </w:r>
           </w:p>
         </w:tc>
@@ -1046,13 +1048,13 @@
               <w:rPr>
                 <w:sz w:val="18"/>
               </w:rPr>
-              <w:t>Sprint 4</w:t>
+              <w:t>0</w:t>
             </w:r>
           </w:p>
         </w:tc>
         <w:tc>
           <w:tcPr>
-            <w:tcW w:type="dxa" w:w="1134"/>
+            <w:tcW w:type="dxa" w:w="1417"/>
           </w:tcPr>
           <w:p>
             <w:r/>
@@ -1060,13 +1062,15 @@
               <w:rPr>
                 <w:sz w:val="18"/>
               </w:rPr>
-              <w:t>EP-11</w:t>
+              <w:t>15</w:t>
             </w:r>
           </w:p>
         </w:tc>
+      </w:tr>
+      <w:tr>
         <w:tc>
           <w:tcPr>
-            <w:tcW w:type="dxa" w:w="3685"/>
+            <w:tcW w:type="dxa" w:w="2835"/>
           </w:tcPr>
           <w:p>
             <w:r/>
@@ -1074,13 +1078,13 @@
               <w:rPr>
                 <w:sz w:val="18"/>
               </w:rPr>
-              <w:t>Reportes y estadísticas</w:t>
+              <w:t>Pruebas</w:t>
             </w:r>
           </w:p>
         </w:tc>
         <w:tc>
           <w:tcPr>
-            <w:tcW w:type="dxa" w:w="850"/>
+            <w:tcW w:type="dxa" w:w="1417"/>
           </w:tcPr>
           <w:p>
             <w:r/>
@@ -1088,19 +1092,60 @@
               <w:rPr>
                 <w:sz w:val="18"/>
               </w:rPr>
-              <w:t>31</w:t>
+              <w:t>22</w:t>
+            </w:r>
+          </w:p>
+        </w:tc>
+        <w:tc>
+          <w:tcPr>
+            <w:tcW w:type="dxa" w:w="1417"/>
+          </w:tcPr>
+          <w:p>
+            <w:r/>
+            <w:r>
+              <w:rPr>
+                <w:sz w:val="18"/>
+              </w:rPr>
+              <w:t>16</w:t>
+            </w:r>
+          </w:p>
+        </w:tc>
+        <w:tc>
+          <w:tcPr>
+            <w:tcW w:type="dxa" w:w="1417"/>
+          </w:tcPr>
+          <w:p>
+            <w:r/>
+            <w:r>
+              <w:rPr>
+                <w:sz w:val="18"/>
+              </w:rPr>
+              <w:t>0</w:t>
+            </w:r>
+          </w:p>
+        </w:tc>
+        <w:tc>
+          <w:tcPr>
+            <w:tcW w:type="dxa" w:w="1417"/>
+          </w:tcPr>
+          <w:p>
+            <w:r/>
+            <w:r>
+              <w:rPr>
+                <w:sz w:val="18"/>
+              </w:rPr>
+              <w:t>6</w:t>
             </w:r>
           </w:p>
         </w:tc>
       </w:tr>
     </w:tbl>
-    <w:p/>
     <w:p>
       <w:pPr>
-        <w:pStyle w:val="ListBullet"/>
+        <w:pStyle w:val="Heading1"/>
       </w:pPr>
       <w:r>
-        <w:t>Sprint = iteración de trabajo (Sprint 1 a Sprint 4).</w:t>
+        <w:t>Cómo se organizó el trabajo en Jira</w:t>
       </w:r>
     </w:p>
     <w:p>
@@ -1108,7 +1153,7 @@
         <w:pStyle w:val="ListBullet"/>
       </w:pPr>
       <w:r>
-        <w:t>Épica = módulo del sistema (EP-01 a EP-11).</w:t>
+        <w:t>Cada fila del plan de tareas PERT (Excel StockPot_Cronograma_Jira) se registró como una tarea de Jira con su responsable y su fecha de vencimiento.</w:t>
       </w:r>
     </w:p>
     <w:p>
@@ -1116,7 +1161,7 @@
         <w:pStyle w:val="ListBullet"/>
       </w:pPr>
       <w:r>
-        <w:t>Historia = requisito funcional (RF-01.1 a RF-11.6): 80 historias.</w:t>
+        <w:t>Iteración 1 (Mateo): usuarios y roles, proveedores y compras. Iteración 2 (Jhorman): inventario, productos y menú. Iteración 3 (Yovany): pedidos, cocina y reservas. Iteración 4 (Ángel): domicilios, pagos, ventas y reportes.</w:t>
       </w:r>
     </w:p>
     <w:p>
@@ -1124,7 +1169,7 @@
         <w:pStyle w:val="ListBullet"/>
       </w:pPr>
       <w:r>
-        <w:t>Tarea = actividad del PERT (análisis, diseño, codificación y pruebas): 166 tareas.</w:t>
+        <w:t>Estados del tablero: Por hacer → En curso → Listo.</w:t>
       </w:r>
     </w:p>
     <w:p>
@@ -1132,7 +1177,15 @@
         <w:pStyle w:val="ListBullet"/>
       </w:pPr>
       <w:r>
-        <w:t>Estado al 2.º corte: Sprints 1, 2 y 4 terminados (70 %); Sprint 3 en curso (30 %).</w:t>
+        <w:t>Estado al 19/10/2026: las Iteraciones 1, 2 y 4 (el 70 % entregado) están en Listo; de la Iteración 3 (el 30 % restante) el análisis y el diseño están En curso, y la codificación y las pruebas están Por hacer.</w:t>
+      </w:r>
+    </w:p>
+    <w:p>
+      <w:pPr>
+        <w:pStyle w:val="ListBullet"/>
+      </w:pPr>
+      <w:r>
+        <w:t>El avance del código se controla además en GitHub (una rama por requisito, merge a develop) y con las pruebas automáticas (226 aprobadas).</w:t>
       </w:r>
     </w:p>
     <w:sectPr>

</xml_diff>